<commit_message>
Federated query lab: refreshed companion (links walkthrough video + demo SQL)
</commit_message>
<xml_diff>
--- a/day2/04_lab-federated-query-bigquery/lab-companion.docx
+++ b/day2/04_lab-federated-query-bigquery/lab-companion.docx
@@ -2,7 +2,7 @@
 <file path=word/document.xml><?xml version="1.0" encoding="utf-8"?>
 <w:document xmlns:w="http://schemas.openxmlformats.org/wordprocessingml/2006/main" xmlns:m="http://schemas.openxmlformats.org/officeDocument/2006/math" xmlns:r="http://schemas.openxmlformats.org/officeDocument/2006/relationships" xmlns:o="urn:schemas-microsoft-com:office:office" xmlns:v="urn:schemas-microsoft-com:vml" xmlns:w10="urn:schemas-microsoft-com:office:word" xmlns:a="http://schemas.openxmlformats.org/drawingml/2006/main" xmlns:pic="http://schemas.openxmlformats.org/drawingml/2006/picture" xmlns:wp="http://schemas.openxmlformats.org/drawingml/2006/wordprocessingDrawing">
   <w:body>
-    <w:bookmarkStart w:id="64" w:name="X43c9db3af5bb614c6fbd90dbb831bc62c96a076"/>
+    <w:bookmarkStart w:id="64" w:name="X526bf456c3af31d4cb0d876c8a029b592defcde"/>
     <w:p>
       <w:pPr>
         <w:pStyle w:val="Heading1"/>
@@ -16,7 +16,88 @@
         <w:pStyle w:val="FirstParagraph"/>
       </w:pPr>
       <w:r>
-        <w:t xml:space="preserve">Day 2 (Tue Oct 6), 10:45–11:15. The lab's own step-by-step lives in your Google Skills classroom seat (listed there as "Federated Query with BigQuery"); this companion is the orientation around it — what you're building, why, and what tends to go wrong.</w:t>
+        <w:t xml:space="preserve">Day 2 (Tue Oct 6), 10:45–11:15. The lab’s own step-by-step lives in your Google Skills classroom seat (listed there as</w:t>
+      </w:r>
+      <w:r>
+        <w:t xml:space="preserve"> </w:t>
+      </w:r>
+      <w:r>
+        <w:t xml:space="preserve">“Federated Query with BigQuery”</w:t>
+      </w:r>
+      <w:r>
+        <w:t xml:space="preserve">); this companion is the orientation around it — what you’re building, why, and what tends to go wrong.</w:t>
+      </w:r>
+    </w:p>
+    <w:p>
+      <w:pPr>
+        <w:pStyle w:val="BodyText"/>
+      </w:pPr>
+      <w:r>
+        <w:rPr>
+          <w:b/>
+          <w:bCs/>
+        </w:rPr>
+        <w:t xml:space="preserve">Watch first:</w:t>
+      </w:r>
+      <w:r>
+        <w:t xml:space="preserve"> </w:t>
+      </w:r>
+      <w:r>
+        <w:rPr>
+          <w:rStyle w:val="VerbatimChar"/>
+        </w:rPr>
+        <w:t xml:space="preserve">lab-walkthrough.mp4</w:t>
+      </w:r>
+      <w:r>
+        <w:t xml:space="preserve"> </w:t>
+      </w:r>
+      <w:r>
+        <w:t xml:space="preserve">(in this folder) is a full instructor run recorded live — connection, IAM grant, and both federated queries, end to end.</w:t>
+      </w:r>
+      <w:r>
+        <w:t xml:space="preserve"> </w:t>
+      </w:r>
+      <w:r>
+        <w:rPr>
+          <w:rStyle w:val="VerbatimChar"/>
+        </w:rPr>
+        <w:t xml:space="preserve">demo-assets.sql</w:t>
+      </w:r>
+      <w:r>
+        <w:t xml:space="preserve"> </w:t>
+      </w:r>
+      <w:r>
+        <w:t xml:space="preserve">(same folder) has every SQL statement used in the video, including the</w:t>
+      </w:r>
+      <w:r>
+        <w:t xml:space="preserve"> </w:t>
+      </w:r>
+      <w:r>
+        <w:rPr>
+          <w:rStyle w:val="VerbatimChar"/>
+        </w:rPr>
+        <w:t xml:space="preserve">web_log</w:t>
+      </w:r>
+      <w:r>
+        <w:t xml:space="preserve"> </w:t>
+      </w:r>
+      <w:r>
+        <w:t xml:space="preserve">and</w:t>
+      </w:r>
+      <w:r>
+        <w:t xml:space="preserve"> </w:t>
+      </w:r>
+      <w:r>
+        <w:rPr>
+          <w:rStyle w:val="VerbatimChar"/>
+        </w:rPr>
+        <w:t xml:space="preserve">customer_details</w:t>
+      </w:r>
+      <w:r>
+        <w:t xml:space="preserve"> </w:t>
+      </w:r>
+      <w:r>
+        <w:t xml:space="preserve">demo data, so you can rebuild the demo anywhere.</w:t>
       </w:r>
     </w:p>
     <w:bookmarkStart w:id="9" w:name="the-one-thing-to-remember"/>
@@ -37,7 +118,7 @@
           <w:b/>
           <w:bCs/>
         </w:rPr>
-        <w:t xml:space="preserve">A federated query is BigQuery's version of a linked server with</w:t>
+        <w:t xml:space="preserve">A federated query is BigQuery’s version of a linked server with</w:t>
       </w:r>
       <w:r>
         <w:rPr>
@@ -200,7 +281,7 @@
         <w:pStyle w:val="Heading2"/>
       </w:pPr>
       <w:r>
-        <w:t xml:space="preserve">What you'll do</w:t>
+        <w:t xml:space="preserve">What you’ll do</w:t>
       </w:r>
     </w:p>
     <w:p>
@@ -293,7 +374,7 @@
         <w:pStyle w:val="BodyText"/>
       </w:pPr>
       <w:r>
-        <w:t xml:space="preserve">The honest trade-offs, so you apply it deliberately: the source system takes the query load, results don't get BigQuery storage optimizations, federated queries are read-only, and on-demand billing charges for the bytes returned from the external side. Federation is a bridge, not a destination — Silver/Gold still belong in managed tables.</w:t>
+        <w:t xml:space="preserve">The honest trade-offs, so you apply it deliberately: the source system takes the query load, results don’t get BigQuery storage optimizations, federated queries are read-only, and on-demand billing charges for the bytes returned from the external side. Federation is a bridge, not a destination — Silver/Gold still belong in managed tables.</w:t>
       </w:r>
     </w:p>
     <w:bookmarkEnd w:id="11"/>
@@ -389,7 +470,7 @@
       </w:r>
     </w:p>
     <w:bookmarkEnd w:id="13"/>
-    <w:bookmarkStart w:id="14" w:name="while-you-work--pointers-not-steps"/>
+    <w:bookmarkStart w:id="14" w:name="while-you-work-pointers-not-steps"/>
     <w:p>
       <w:pPr>
         <w:pStyle w:val="Heading2"/>
@@ -411,7 +492,35 @@
           <w:b/>
           <w:bCs/>
         </w:rPr>
-        <w:t xml:space="preserve">The connection setup is the "linked server definition" moment.</w:t>
+        <w:t xml:space="preserve">The connection setup is the</w:t>
+      </w:r>
+      <w:r>
+        <w:rPr>
+          <w:b/>
+          <w:bCs/>
+        </w:rPr>
+        <w:t xml:space="preserve"> </w:t>
+      </w:r>
+      <w:r>
+        <w:rPr>
+          <w:b/>
+          <w:bCs/>
+        </w:rPr>
+        <w:t xml:space="preserve">“linked server definition”</w:t>
+      </w:r>
+      <w:r>
+        <w:rPr>
+          <w:b/>
+          <w:bCs/>
+        </w:rPr>
+        <w:t xml:space="preserve"> </w:t>
+      </w:r>
+      <w:r>
+        <w:rPr>
+          <w:b/>
+          <w:bCs/>
+        </w:rPr>
+        <w:t xml:space="preserve">moment.</w:t>
       </w:r>
       <w:r>
         <w:t xml:space="preserve"> </w:t>
@@ -439,7 +548,7 @@
         <w:t xml:space="preserve"> </w:t>
       </w:r>
       <w:r>
-        <w:t xml:space="preserve">If the console asks you to enable an API (for example the BigQuery Connection API) or confirm a consent screen, click through — that's normal in a fresh lab project.</w:t>
+        <w:t xml:space="preserve">If the console asks you to enable an API (for example the BigQuery Connection API) or confirm a consent screen, click through — that’s normal in a fresh lab project.</w:t>
       </w:r>
     </w:p>
     <w:p>
@@ -511,7 +620,7 @@
         <w:t xml:space="preserve"> </w:t>
       </w:r>
       <w:r>
-        <w:t xml:space="preserve">the way Google's own examples do).</w:t>
+        <w:t xml:space="preserve">the way Google’s own examples do).</w:t>
       </w:r>
     </w:p>
     <w:p>
@@ -564,7 +673,7 @@
     </w:p>
     <w:p>
       <w:pPr>
-        <w:pStyle w:val="BodyText"/>
+        <w:pStyle w:val="CaptionedFigure"/>
       </w:pPr>
       <w:r>
         <w:drawing>
@@ -611,6 +720,14 @@
     </w:p>
     <w:p>
       <w:pPr>
+        <w:pStyle w:val="ImageCaption"/>
+      </w:pPr>
+      <w:r>
+        <w:t xml:space="preserve">Consent prompt in a fresh lab project</w:t>
+      </w:r>
+    </w:p>
+    <w:p>
+      <w:pPr>
         <w:pStyle w:val="BodyText"/>
       </w:pPr>
       <w:r>
@@ -667,7 +784,7 @@
     </w:p>
     <w:p>
       <w:pPr>
-        <w:pStyle w:val="BodyText"/>
+        <w:pStyle w:val="CaptionedFigure"/>
       </w:pPr>
       <w:r>
         <w:drawing>
@@ -714,6 +831,14 @@
     </w:p>
     <w:p>
       <w:pPr>
+        <w:pStyle w:val="ImageCaption"/>
+      </w:pPr>
+      <w:r>
+        <w:t xml:space="preserve">Add data flyout with the AlloyDB card</w:t>
+      </w:r>
+    </w:p>
+    <w:p>
+      <w:pPr>
         <w:pStyle w:val="BodyText"/>
       </w:pPr>
       <w:r>
@@ -733,12 +858,24 @@
         <w:t xml:space="preserve"> </w:t>
       </w:r>
       <w:r>
-        <w:t xml:space="preserve">under "Access external data in place" — federation, not a load or a Datastream replication.</w:t>
-      </w:r>
-    </w:p>
-    <w:p>
-      <w:pPr>
-        <w:pStyle w:val="BodyText"/>
+        <w:t xml:space="preserve">under</w:t>
+      </w:r>
+      <w:r>
+        <w:t xml:space="preserve"> </w:t>
+      </w:r>
+      <w:r>
+        <w:t xml:space="preserve">“Access external data in place”</w:t>
+      </w:r>
+      <w:r>
+        <w:t xml:space="preserve"> </w:t>
+      </w:r>
+      <w:r>
+        <w:t xml:space="preserve">— federation, not a load or a Datastream replication.</w:t>
+      </w:r>
+    </w:p>
+    <w:p>
+      <w:pPr>
+        <w:pStyle w:val="CaptionedFigure"/>
       </w:pPr>
       <w:r>
         <w:drawing>
@@ -785,10 +922,30 @@
     </w:p>
     <w:p>
       <w:pPr>
+        <w:pStyle w:val="ImageCaption"/>
+      </w:pPr>
+      <w:r>
+        <w:t xml:space="preserve">BigQuery Federation card</w:t>
+      </w:r>
+    </w:p>
+    <w:p>
+      <w:pPr>
         <w:pStyle w:val="BodyText"/>
       </w:pPr>
       <w:r>
-        <w:t xml:space="preserve">The "linked server definition" moment: Connection type</w:t>
+        <w:t xml:space="preserve">The</w:t>
+      </w:r>
+      <w:r>
+        <w:t xml:space="preserve"> </w:t>
+      </w:r>
+      <w:r>
+        <w:t xml:space="preserve">“linked server definition”</w:t>
+      </w:r>
+      <w:r>
+        <w:t xml:space="preserve"> </w:t>
+      </w:r>
+      <w:r>
+        <w:t xml:space="preserve">moment: Connection type</w:t>
       </w:r>
       <w:r>
         <w:t xml:space="preserve"> </w:t>
@@ -845,7 +1002,7 @@
     </w:p>
     <w:p>
       <w:pPr>
-        <w:pStyle w:val="BodyText"/>
+        <w:pStyle w:val="CaptionedFigure"/>
       </w:pPr>
       <w:r>
         <w:drawing>
@@ -892,6 +1049,14 @@
     </w:p>
     <w:p>
       <w:pPr>
+        <w:pStyle w:val="ImageCaption"/>
+      </w:pPr>
+      <w:r>
+        <w:t xml:space="preserve">Connection form, top half</w:t>
+      </w:r>
+    </w:p>
+    <w:p>
+      <w:pPr>
         <w:pStyle w:val="BodyText"/>
       </w:pPr>
       <w:r>
@@ -923,7 +1088,7 @@
         <w:t xml:space="preserve"> </w:t>
       </w:r>
       <w:r>
-        <w:t xml:space="preserve">lab's instructions panel, database</w:t>
+        <w:t xml:space="preserve">lab’s instructions panel, database</w:t>
       </w:r>
       <w:r>
         <w:t xml:space="preserve"> </w:t>
@@ -953,7 +1118,7 @@
     </w:p>
     <w:p>
       <w:pPr>
-        <w:pStyle w:val="BodyText"/>
+        <w:pStyle w:val="CaptionedFigure"/>
       </w:pPr>
       <w:r>
         <w:drawing>
@@ -1000,15 +1165,29 @@
     </w:p>
     <w:p>
       <w:pPr>
+        <w:pStyle w:val="ImageCaption"/>
+      </w:pPr>
+      <w:r>
+        <w:t xml:space="preserve">Connection form, bottom half</w:t>
+      </w:r>
+    </w:p>
+    <w:p>
+      <w:pPr>
         <w:pStyle w:val="BodyText"/>
       </w:pPr>
       <w:r>
-        <w:t xml:space="preserve">"AlloyDB-weblog" created. The linked server exists; nothing in it can be queried yet — its service account needs IAM first.</w:t>
-      </w:r>
-    </w:p>
-    <w:p>
-      <w:pPr>
-        <w:pStyle w:val="BodyText"/>
+        <w:t xml:space="preserve">“AlloyDB-weblog”</w:t>
+      </w:r>
+      <w:r>
+        <w:t xml:space="preserve"> </w:t>
+      </w:r>
+      <w:r>
+        <w:t xml:space="preserve">created. The linked server exists; nothing in it can be queried yet — its service account needs IAM first.</w:t>
+      </w:r>
+    </w:p>
+    <w:p>
+      <w:pPr>
+        <w:pStyle w:val="CaptionedFigure"/>
       </w:pPr>
       <w:r>
         <w:drawing>
@@ -1055,6 +1234,14 @@
     </w:p>
     <w:p>
       <w:pPr>
+        <w:pStyle w:val="ImageCaption"/>
+      </w:pPr>
+      <w:r>
+        <w:t xml:space="preserve">Connection created toast</w:t>
+      </w:r>
+    </w:p>
+    <w:p>
+      <w:pPr>
         <w:pStyle w:val="BodyText"/>
       </w:pPr>
       <w:r>
@@ -1079,7 +1266,7 @@
     </w:p>
     <w:p>
       <w:pPr>
-        <w:pStyle w:val="BodyText"/>
+        <w:pStyle w:val="CaptionedFigure"/>
       </w:pPr>
       <w:r>
         <w:drawing>
@@ -1126,6 +1313,14 @@
     </w:p>
     <w:p>
       <w:pPr>
+        <w:pStyle w:val="ImageCaption"/>
+      </w:pPr>
+      <w:r>
+        <w:t xml:space="preserve">Connection details with the service account id</w:t>
+      </w:r>
+    </w:p>
+    <w:p>
+      <w:pPr>
         <w:pStyle w:val="BodyText"/>
       </w:pPr>
       <w:r>
@@ -1187,12 +1382,24 @@
         <w:t xml:space="preserve"> </w:t>
       </w:r>
       <w:r>
-        <w:t xml:space="preserve">— and Save. Wait for the "Policy updated" toast.</w:t>
-      </w:r>
-    </w:p>
-    <w:p>
-      <w:pPr>
-        <w:pStyle w:val="BodyText"/>
+        <w:t xml:space="preserve">— and Save. Wait for the</w:t>
+      </w:r>
+      <w:r>
+        <w:t xml:space="preserve"> </w:t>
+      </w:r>
+      <w:r>
+        <w:t xml:space="preserve">“Policy updated”</w:t>
+      </w:r>
+      <w:r>
+        <w:t xml:space="preserve"> </w:t>
+      </w:r>
+      <w:r>
+        <w:t xml:space="preserve">toast.</w:t>
+      </w:r>
+    </w:p>
+    <w:p>
+      <w:pPr>
+        <w:pStyle w:val="CaptionedFigure"/>
       </w:pPr>
       <w:r>
         <w:drawing>
@@ -1239,15 +1446,35 @@
     </w:p>
     <w:p>
       <w:pPr>
+        <w:pStyle w:val="ImageCaption"/>
+      </w:pPr>
+      <w:r>
+        <w:t xml:space="preserve">IAM grant panel with both roles</w:t>
+      </w:r>
+    </w:p>
+    <w:p>
+      <w:pPr>
         <w:pStyle w:val="BodyText"/>
       </w:pPr>
       <w:r>
-        <w:t xml:space="preserve">What the chip trap looks like: the email is in the box, yet Save says "Enter at least one principal" — the text was never committed as a chip.</w:t>
-      </w:r>
-    </w:p>
-    <w:p>
-      <w:pPr>
-        <w:pStyle w:val="BodyText"/>
+        <w:t xml:space="preserve">What the chip trap looks like: the email is in the box, yet Save says</w:t>
+      </w:r>
+      <w:r>
+        <w:t xml:space="preserve"> </w:t>
+      </w:r>
+      <w:r>
+        <w:t xml:space="preserve">“Enter at least one principal”</w:t>
+      </w:r>
+      <w:r>
+        <w:t xml:space="preserve"> </w:t>
+      </w:r>
+      <w:r>
+        <w:t xml:space="preserve">— the text was never committed as a chip.</w:t>
+      </w:r>
+    </w:p>
+    <w:p>
+      <w:pPr>
+        <w:pStyle w:val="CaptionedFigure"/>
       </w:pPr>
       <w:r>
         <w:drawing>
@@ -1294,6 +1521,14 @@
     </w:p>
     <w:p>
       <w:pPr>
+        <w:pStyle w:val="ImageCaption"/>
+      </w:pPr>
+      <w:r>
+        <w:t xml:space="preserve">The chip trap</w:t>
+      </w:r>
+    </w:p>
+    <w:p>
+      <w:pPr>
         <w:pStyle w:val="BodyText"/>
       </w:pPr>
       <w:r>
@@ -1333,7 +1568,7 @@
     </w:p>
     <w:p>
       <w:pPr>
-        <w:pStyle w:val="BodyText"/>
+        <w:pStyle w:val="CaptionedFigure"/>
       </w:pPr>
       <w:r>
         <w:drawing>
@@ -1380,6 +1615,14 @@
     </w:p>
     <w:p>
       <w:pPr>
+        <w:pStyle w:val="ImageCaption"/>
+      </w:pPr>
+      <w:r>
+        <w:t xml:space="preserve">Connection in the Explorer tree</w:t>
+      </w:r>
+    </w:p>
+    <w:p>
+      <w:pPr>
         <w:pStyle w:val="BodyText"/>
       </w:pPr>
       <w:r>
@@ -1395,7 +1638,7 @@
         <w:t xml:space="preserve">EXTERNAL_QUERY</w:t>
       </w:r>
       <w:r>
-        <w:t xml:space="preserve">, green: rows coming back from AlloyDB's</w:t>
+        <w:t xml:space="preserve">, green: rows coming back from AlloyDB’s</w:t>
       </w:r>
       <w:r>
         <w:t xml:space="preserve"> </w:t>
@@ -1415,7 +1658,7 @@
     </w:p>
     <w:p>
       <w:pPr>
-        <w:pStyle w:val="BodyText"/>
+        <w:pStyle w:val="CaptionedFigure"/>
       </w:pPr>
       <w:r>
         <w:drawing>
@@ -1462,6 +1705,14 @@
     </w:p>
     <w:p>
       <w:pPr>
+        <w:pStyle w:val="ImageCaption"/>
+      </w:pPr>
+      <w:r>
+        <w:t xml:space="preserve">First federated query results</w:t>
+      </w:r>
+    </w:p>
+    <w:p>
+      <w:pPr>
         <w:pStyle w:val="BodyText"/>
       </w:pPr>
       <w:r>
@@ -1536,7 +1787,7 @@
     </w:p>
     <w:p>
       <w:pPr>
-        <w:pStyle w:val="BodyText"/>
+        <w:pStyle w:val="CaptionedFigure"/>
       </w:pPr>
       <w:r>
         <w:drawing>
@@ -1583,15 +1834,23 @@
     </w:p>
     <w:p>
       <w:pPr>
+        <w:pStyle w:val="ImageCaption"/>
+      </w:pPr>
+      <w:r>
+        <w:t xml:space="preserve">The join results</w:t>
+      </w:r>
+    </w:p>
+    <w:p>
+      <w:pPr>
         <w:pStyle w:val="BodyText"/>
       </w:pPr>
       <w:r>
-        <w:t xml:space="preserve">And when it goes wrong, this is the face of it — the PostgreSQL connection error with Google's own troubleshooting link. Nine times out of ten it is the IAM chip trap or the per-lab password.</w:t>
-      </w:r>
-    </w:p>
-    <w:p>
-      <w:pPr>
-        <w:pStyle w:val="BodyText"/>
+        <w:t xml:space="preserve">And when it goes wrong, this is the face of it — the PostgreSQL connection error with Google’s own troubleshooting link. Nine times out of ten it is the IAM chip trap or the per-lab password.</w:t>
+      </w:r>
+    </w:p>
+    <w:p>
+      <w:pPr>
+        <w:pStyle w:val="CaptionedFigure"/>
       </w:pPr>
       <w:r>
         <w:drawing>
@@ -1636,6 +1895,14 @@
         </w:drawing>
       </w:r>
     </w:p>
+    <w:p>
+      <w:pPr>
+        <w:pStyle w:val="ImageCaption"/>
+      </w:pPr>
+      <w:r>
+        <w:t xml:space="preserve">The PostgreSQL connection error</w:t>
+      </w:r>
+    </w:p>
     <w:bookmarkEnd w:id="54"/>
     <w:bookmarkStart w:id="55" w:name="common-gotchas"/>
     <w:p>
@@ -1658,13 +1925,13 @@
           <w:b/>
           <w:bCs/>
         </w:rPr>
-        <w:t xml:space="preserve">"Connect to PostgreSQL server failed: server closed the connection unexpectedly"</w:t>
-      </w:r>
-      <w:r>
-        <w:t xml:space="preserve"> </w:t>
-      </w:r>
-      <w:r>
-        <w:t xml:space="preserve">— this one error has two sneaky causes, both at setup time. First, credentials: the connection form values are per-lab — copy the password from YOUR running lab's instructions panel (it matches your console password), not from a stale manual page or a previous run. Second — and this one bites everyone — the IAM grant silently never happened: see the chip trap next.</w:t>
+        <w:t xml:space="preserve">“Connect to PostgreSQL server failed: server closed the connection unexpectedly”</w:t>
+      </w:r>
+      <w:r>
+        <w:t xml:space="preserve"> </w:t>
+      </w:r>
+      <w:r>
+        <w:t xml:space="preserve">— this one error has two sneaky causes, both at setup time. First, credentials: the connection form values are per-lab — copy the password from YOUR running lab’s instructions panel (it matches your console password), not from a stale manual page or a previous run. Second — and this one bites everyone — the IAM grant silently never happened: see the chip trap next.</w:t>
       </w:r>
     </w:p>
     <w:p>
@@ -1685,7 +1952,55 @@
         <w:t xml:space="preserve"> </w:t>
       </w:r>
       <w:r>
-        <w:t xml:space="preserve">when you paste the connection service account into "New principals" on the IAM "Grant access" panel, you MUST press Enter afterwards so the address turns into a chip — otherwise Save is rejected with "Enter at least one principal" (easy to miss: the email is sitting right there in the box). If you click a suggestion as well, you can end up with a duplicate chip — delete one with its ×. The grant only counts when you see the "Policy updated" toast; check the principal actually appears in the IAM list. Without this grant, every</w:t>
+        <w:t xml:space="preserve">when you paste the connection service account into</w:t>
+      </w:r>
+      <w:r>
+        <w:t xml:space="preserve"> </w:t>
+      </w:r>
+      <w:r>
+        <w:t xml:space="preserve">“New principals”</w:t>
+      </w:r>
+      <w:r>
+        <w:t xml:space="preserve"> </w:t>
+      </w:r>
+      <w:r>
+        <w:t xml:space="preserve">on the IAM</w:t>
+      </w:r>
+      <w:r>
+        <w:t xml:space="preserve"> </w:t>
+      </w:r>
+      <w:r>
+        <w:t xml:space="preserve">“Grant access”</w:t>
+      </w:r>
+      <w:r>
+        <w:t xml:space="preserve"> </w:t>
+      </w:r>
+      <w:r>
+        <w:t xml:space="preserve">panel, you MUST press Enter afterwards so the address turns into a chip — otherwise Save is rejected with</w:t>
+      </w:r>
+      <w:r>
+        <w:t xml:space="preserve"> </w:t>
+      </w:r>
+      <w:r>
+        <w:t xml:space="preserve">“Enter at least one principal”</w:t>
+      </w:r>
+      <w:r>
+        <w:t xml:space="preserve"> </w:t>
+      </w:r>
+      <w:r>
+        <w:t xml:space="preserve">(easy to miss: the email is sitting right there in the box). If you click a suggestion as well, you can end up with a duplicate chip — delete one with its ×. The grant only counts when you see the</w:t>
+      </w:r>
+      <w:r>
+        <w:t xml:space="preserve"> </w:t>
+      </w:r>
+      <w:r>
+        <w:t xml:space="preserve">“Policy updated”</w:t>
+      </w:r>
+      <w:r>
+        <w:t xml:space="preserve"> </w:t>
+      </w:r>
+      <w:r>
+        <w:t xml:space="preserve">toast; check the principal actually appears in the IAM list. Without this grant, every</w:t>
       </w:r>
       <w:r>
         <w:t xml:space="preserve"> </w:t>
@@ -1721,7 +2036,13 @@
         <w:t xml:space="preserve"> </w:t>
       </w:r>
       <w:r>
-        <w:t xml:space="preserve">— you created the connection in the wrong project and now nothing in the lab matches. Check the picker first whenever something "isn't there."</w:t>
+        <w:t xml:space="preserve">— you created the connection in the wrong project and now nothing in the lab matches. Check the picker first whenever something</w:t>
+      </w:r>
+      <w:r>
+        <w:t xml:space="preserve"> </w:t>
+      </w:r>
+      <w:r>
+        <w:t xml:space="preserve">“isn’t there.”</w:t>
       </w:r>
     </w:p>
     <w:p>
@@ -1805,7 +2126,7 @@
         <w:t xml:space="preserve"> </w:t>
       </w:r>
       <w:r>
-        <w:t xml:space="preserve">— the connection resource's location must match where the query runs, and a single-region BigQuery setup can only federate to sources in the same region. If the lab says one region, use it everywhere.</w:t>
+        <w:t xml:space="preserve">— the connection resource’s location must match where the query runs, and a single-region BigQuery setup can only federate to sources in the same region. If the lab says one region, use it everywhere.</w:t>
       </w:r>
     </w:p>
     <w:p>
@@ -1841,7 +2162,7 @@
           <w:b/>
           <w:bCs/>
         </w:rPr>
-        <w:t xml:space="preserve">"Why can't I see the AlloyDB tables in the Explorer pane?"</w:t>
+        <w:t xml:space="preserve">“Why can’t I see the AlloyDB tables in the Explorer pane?”</w:t>
       </w:r>
       <w:r>
         <w:t xml:space="preserve"> </w:t>
@@ -1874,7 +2195,6 @@
     </w:p>
     <w:p>
       <w:pPr>
-        <w:pStyle w:val="Compact"/>
         <w:numPr>
           <w:ilvl w:val="0"/>
           <w:numId w:val="1006"/>
@@ -1886,7 +2206,6 @@
     </w:p>
     <w:p>
       <w:pPr>
-        <w:pStyle w:val="Compact"/>
         <w:numPr>
           <w:ilvl w:val="0"/>
           <w:numId w:val="1006"/>
@@ -1928,14 +2247,13 @@
     </w:p>
     <w:p>
       <w:pPr>
-        <w:pStyle w:val="Compact"/>
         <w:numPr>
           <w:ilvl w:val="0"/>
           <w:numId w:val="1006"/>
         </w:numPr>
       </w:pPr>
       <w:r>
-        <w:t xml:space="preserve">List the remote database's metadata through the same connection:</w:t>
+        <w:t xml:space="preserve">List the remote database’s metadata through the same connection:</w:t>
       </w:r>
     </w:p>
     <w:p>
@@ -2018,7 +2336,6 @@
     </w:p>
     <w:p>
       <w:pPr>
-        <w:pStyle w:val="Compact"/>
         <w:numPr>
           <w:ilvl w:val="0"/>
           <w:numId w:val="1000"/>
@@ -2037,19 +2354,18 @@
         <w:t xml:space="preserve">information_schema</w:t>
       </w:r>
       <w:r>
-        <w:t xml:space="preserve">, not BigQuery's).</w:t>
-      </w:r>
-    </w:p>
-    <w:p>
-      <w:pPr>
-        <w:pStyle w:val="Compact"/>
+        <w:t xml:space="preserve">, not BigQuery’s).</w:t>
+      </w:r>
+    </w:p>
+    <w:p>
+      <w:pPr>
         <w:numPr>
           <w:ilvl w:val="0"/>
           <w:numId w:val="1006"/>
         </w:numPr>
       </w:pPr>
       <w:r>
-        <w:t xml:space="preserve">Open the job's</w:t>
+        <w:t xml:space="preserve">Open the job’s</w:t>
       </w:r>
       <w:r>
         <w:t xml:space="preserve"> </w:t>
@@ -2271,13 +2587,41 @@
           <w:b/>
           <w:bCs/>
         </w:rPr>
-        <w:t xml:space="preserve">The nightly "extract the operational tables just so we can join them" jobs</w:t>
-      </w:r>
-      <w:r>
-        <w:t xml:space="preserve"> </w:t>
-      </w:r>
-      <w:r>
-        <w:t xml:space="preserve">— during the migration you query data where it lives and load it only when there's a reason to.</w:t>
+        <w:t xml:space="preserve">The nightly</w:t>
+      </w:r>
+      <w:r>
+        <w:rPr>
+          <w:b/>
+          <w:bCs/>
+        </w:rPr>
+        <w:t xml:space="preserve"> </w:t>
+      </w:r>
+      <w:r>
+        <w:rPr>
+          <w:b/>
+          <w:bCs/>
+        </w:rPr>
+        <w:t xml:space="preserve">“extract the operational tables just so we can join them”</w:t>
+      </w:r>
+      <w:r>
+        <w:rPr>
+          <w:b/>
+          <w:bCs/>
+        </w:rPr>
+        <w:t xml:space="preserve"> </w:t>
+      </w:r>
+      <w:r>
+        <w:rPr>
+          <w:b/>
+          <w:bCs/>
+        </w:rPr>
+        <w:t xml:space="preserve">jobs</w:t>
+      </w:r>
+      <w:r>
+        <w:t xml:space="preserve"> </w:t>
+      </w:r>
+      <w:r>
+        <w:t xml:space="preserve">— during the migration you query data where it lives and load it only when there’s a reason to.</w:t>
       </w:r>
     </w:p>
     <w:p>
@@ -2295,7 +2639,7 @@
         <w:t xml:space="preserve"> </w:t>
       </w:r>
       <w:r>
-        <w:t xml:space="preserve">Your Bronze lands in GCS/BigQuery, but anything still operational on the SQL Server side stays reachable during the migration. You don't have to move it all first.</w:t>
+        <w:t xml:space="preserve">Your Bronze lands in GCS/BigQuery, but anything still operational on the SQL Server side stays reachable during the migration. You don’t have to move it all first.</w:t>
       </w:r>
     </w:p>
     <w:bookmarkEnd w:id="58"/>
@@ -2389,7 +2733,7 @@
         <w:t xml:space="preserve"> </w:t>
       </w:r>
       <w:r>
-        <w:t xml:space="preserve">— what the lab's stand-in operational store actually is</w:t>
+        <w:t xml:space="preserve">— what the lab’s stand-in operational store actually is</w:t>
       </w:r>
     </w:p>
     <w:p>

</xml_diff>